<commit_message>
Catat pembersihan branch dan review peta serta presentasi final
</commit_message>
<xml_diff>
--- a/docs/final/Addendum_presentasi_23_september.docx
+++ b/docs/final/Addendum_presentasi_23_september.docx
@@ -78,6 +78,19 @@
     <w:p>
       <w:r>
         <w:t>TM selesai; tim urutan pertama, 10 menit presentasi/demo dan 15 menit tanya jawab. Deadline PDF belum diinformasikan. Pembagian pembicara masih usulan. Tim perlu konfirmasi deadline, dua latihan dengan stopwatch, uji proyektor/QR di HP, dan laptop cadangan. MP4/poster dan bukti pengguna belum selesai/dikonfirmasi. Akurasi pasut tidak boleh disebut akurasi genangan per ruas.</w:t>
+      </w:r>
+    </w:p>
+    <w:p>
+      <w:pPr>
+        <w:pStyle w:val="Heading2"/>
+      </w:pPr>
+      <w:r>
+        <w:t>Review lanjutan</w:t>
+      </w:r>
+    </w:p>
+    <w:p>
+      <w:r>
+        <w:t>Enam branch lama yang seluruh commit-nya masuk main dihapus; main dan pratinjau OSM dipertahankan. Kedua peta dibandingkan pada perjalanan, waktu, dan data identik. Struktur delapan slide tetap sesuai durasi, dengan usulan memperjelas persona, bukti fungsi, dan biaya menunggu pada contoh 08.00?13.00. Rekomendasi belum mengubah PPTX/PDF. Rincian: docs/final/review_branch_peta_presentasi_23_september.md.</w:t>
       </w:r>
     </w:p>
     <w:sectPr>

</xml_diff>